<commit_message>
Add complete AI product review intelligence system
</commit_message>
<xml_diff>
--- a/Rapport_Projet.docx
+++ b/Rapport_Projet.docx
@@ -5,75 +5,319 @@
     <w:p>
       <w:pPr>
         <w:jc w:val="center"/>
-      </w:pPr>
-      <w:r>
         <w:rPr>
           <w:b/>
-          <w:color w:val="1F4E79"/>
+          <w:color w:val="002060"/>
           <w:sz w:val="56"/>
         </w:rPr>
-        <w:br/>
-      </w:r>
+      </w:pPr>
       <w:r>
         <w:rPr>
           <w:b/>
-          <w:color w:val="1F4E79"/>
+          <w:color w:val="002060"/>
           <w:sz w:val="56"/>
         </w:rPr>
-        <w:br/>
         <w:t>AI Product Review</w:t>
       </w:r>
       <w:r>
         <w:rPr>
           <w:b/>
-          <w:color w:val="1F4E79"/>
+          <w:color w:val="002060"/>
           <w:sz w:val="56"/>
         </w:rPr>
-        <w:br/>
+        <w:t xml:space="preserve"> </w:t>
+      </w:r>
+      <w:r>
+        <w:rPr>
+          <w:b/>
+          <w:color w:val="002060"/>
+          <w:sz w:val="56"/>
+        </w:rPr>
         <w:t>Intelligence System</w:t>
       </w:r>
     </w:p>
     <w:p>
       <w:pPr>
         <w:jc w:val="center"/>
-      </w:pPr>
+        <w:rPr>
+          <w:sz w:val="48"/>
+          <w:szCs w:val="48"/>
+        </w:rPr>
+      </w:pPr>
+      <w:r>
+        <w:rPr>
+          <w:sz w:val="48"/>
+          <w:szCs w:val="48"/>
+        </w:rPr>
+        <w:br/>
+      </w:r>
       <w:r>
         <w:rPr>
           <w:b/>
-          <w:color w:val="4F81BD"/>
-          <w:sz w:val="36"/>
+          <w:bCs/>
+          <w:color w:val="002060"/>
+          <w:sz w:val="48"/>
+          <w:szCs w:val="48"/>
         </w:rPr>
-        <w:t>Complete Project Report</w:t>
+        <w:t>Academic Year:</w:t>
+      </w:r>
+      <w:r>
+        <w:rPr>
+          <w:color w:val="002060"/>
+          <w:sz w:val="48"/>
+          <w:szCs w:val="48"/>
+        </w:rPr>
+        <w:t xml:space="preserve"> </w:t>
+      </w:r>
+      <w:r>
+        <w:rPr>
+          <w:sz w:val="48"/>
+          <w:szCs w:val="48"/>
+        </w:rPr>
+        <w:t>2025 / 2026</w:t>
+      </w:r>
+      <w:r>
+        <w:rPr>
+          <w:sz w:val="48"/>
+          <w:szCs w:val="48"/>
+        </w:rPr>
+        <w:br/>
+      </w:r>
+      <w:r>
+        <w:rPr>
+          <w:b/>
+          <w:bCs/>
+          <w:color w:val="002060"/>
+          <w:sz w:val="48"/>
+          <w:szCs w:val="48"/>
+        </w:rPr>
+        <w:t>Module:</w:t>
+      </w:r>
+      <w:r>
+        <w:rPr>
+          <w:color w:val="002060"/>
+          <w:sz w:val="48"/>
+          <w:szCs w:val="48"/>
+        </w:rPr>
+        <w:t xml:space="preserve"> </w:t>
+      </w:r>
+      <w:r>
+        <w:rPr>
+          <w:sz w:val="48"/>
+          <w:szCs w:val="48"/>
+        </w:rPr>
+        <w:t>Deep Learning</w:t>
+      </w:r>
+      <w:r>
+        <w:rPr>
+          <w:sz w:val="48"/>
+          <w:szCs w:val="48"/>
+        </w:rPr>
+        <w:br/>
+      </w:r>
+      <w:r>
+        <w:rPr>
+          <w:b/>
+          <w:bCs/>
+          <w:color w:val="002060"/>
+          <w:sz w:val="48"/>
+          <w:szCs w:val="48"/>
+        </w:rPr>
+        <w:t>Program:</w:t>
+      </w:r>
+      <w:r>
+        <w:rPr>
+          <w:color w:val="002060"/>
+          <w:sz w:val="48"/>
+          <w:szCs w:val="48"/>
+        </w:rPr>
+        <w:t xml:space="preserve"> </w:t>
+      </w:r>
+      <w:r>
+        <w:rPr>
+          <w:sz w:val="48"/>
+          <w:szCs w:val="48"/>
+        </w:rPr>
+        <w:t>Big Data &amp; Artificial Intelligence</w:t>
       </w:r>
     </w:p>
     <w:p>
       <w:pPr>
         <w:jc w:val="center"/>
-      </w:pPr>
-      <w:r>
         <w:rPr>
-          <w:sz w:val="24"/>
+          <w:sz w:val="18"/>
+          <w:szCs w:val="18"/>
+        </w:rPr>
+      </w:pPr>
+    </w:p>
+    <w:p>
+      <w:pPr>
+        <w:jc w:val="center"/>
+        <w:rPr>
+          <w:b/>
+          <w:bCs/>
+          <w:sz w:val="48"/>
+          <w:szCs w:val="48"/>
+        </w:rPr>
+      </w:pPr>
+      <w:r>
+        <w:rPr>
+          <w:b/>
+          <w:bCs/>
+          <w:color w:val="002060"/>
+          <w:sz w:val="48"/>
+          <w:szCs w:val="48"/>
+        </w:rPr>
+        <w:t>Prepared by:</w:t>
+      </w:r>
+      <w:r>
+        <w:rPr>
+          <w:sz w:val="48"/>
+          <w:szCs w:val="48"/>
         </w:rPr>
         <w:br/>
-        <w:t>Multi-agent product review intelligence system</w:t>
+        <w:t>Abdallah ALNAJJAR</w:t>
       </w:r>
       <w:r>
         <w:rPr>
-          <w:sz w:val="24"/>
+          <w:sz w:val="48"/>
+          <w:szCs w:val="48"/>
         </w:rPr>
         <w:br/>
-        <w:t>with fine-tuned DistilBERT, Streamlit, CrewAI, and Gemini API</w:t>
+        <w:t>Fahd CHAIB</w:t>
+      </w:r>
+      <w:r>
+        <w:rPr>
+          <w:sz w:val="48"/>
+          <w:szCs w:val="48"/>
+        </w:rPr>
+        <w:br/>
+        <w:t>Nassim SEHLI</w:t>
+      </w:r>
+      <w:r>
+        <w:rPr>
+          <w:sz w:val="48"/>
+          <w:szCs w:val="48"/>
+        </w:rPr>
+        <w:br/>
+        <w:t>Mohamed Houssam ELJABBAR</w:t>
       </w:r>
     </w:p>
-    <w:p/>
     <w:p>
-      <w:r>
+      <w:pPr>
+        <w:jc w:val="center"/>
+        <w:rPr>
+          <w:sz w:val="48"/>
+          <w:szCs w:val="48"/>
+        </w:rPr>
+      </w:pPr>
+    </w:p>
+    <w:p>
+      <w:pPr>
+        <w:jc w:val="center"/>
+        <w:rPr>
+          <w:i/>
+          <w:iCs/>
+          <w:sz w:val="48"/>
+          <w:szCs w:val="48"/>
+        </w:rPr>
+      </w:pPr>
+      <w:r>
+        <w:rPr>
+          <w:b/>
+          <w:bCs/>
+          <w:color w:val="002060"/>
+          <w:sz w:val="48"/>
+          <w:szCs w:val="48"/>
+        </w:rPr>
+        <w:t>Supervised by:</w:t>
+      </w:r>
+      <w:r>
+        <w:rPr>
+          <w:sz w:val="48"/>
+          <w:szCs w:val="48"/>
+        </w:rPr>
+        <w:br/>
+      </w:r>
+      <w:r>
+        <w:rPr>
+          <w:i/>
+          <w:iCs/>
+          <w:sz w:val="48"/>
+          <w:szCs w:val="48"/>
+        </w:rPr>
+        <w:t>Mr. Hakim HAFIDI</w:t>
+      </w:r>
+    </w:p>
+    <w:p>
+      <w:pPr>
+        <w:jc w:val="center"/>
+        <w:rPr>
+          <w:sz w:val="48"/>
+          <w:szCs w:val="48"/>
+        </w:rPr>
+      </w:pPr>
+    </w:p>
+    <w:p>
+      <w:pPr>
+        <w:jc w:val="center"/>
+        <w:rPr>
+          <w:sz w:val="48"/>
+          <w:szCs w:val="48"/>
+          <w:lang w:val="fr-FR"/>
+        </w:rPr>
+      </w:pPr>
+      <w:r>
+        <w:rPr>
+          <w:b/>
+          <w:bCs/>
+          <w:color w:val="002060"/>
+          <w:sz w:val="48"/>
+          <w:szCs w:val="48"/>
+          <w:lang w:val="fr-FR"/>
+        </w:rPr>
+        <w:t>Institution:</w:t>
+      </w:r>
+      <w:r>
+        <w:rPr>
+          <w:sz w:val="48"/>
+          <w:szCs w:val="48"/>
+          <w:lang w:val="fr-FR"/>
+        </w:rPr>
+        <w:br/>
+        <w:t>Université Internationale de Rabat</w:t>
+      </w:r>
+    </w:p>
+    <w:p>
+      <w:pPr>
+        <w:jc w:val="center"/>
+        <w:rPr>
+          <w:lang w:val="fr-FR"/>
+        </w:rPr>
+      </w:pPr>
+    </w:p>
+    <w:p>
+      <w:pPr>
+        <w:rPr>
+          <w:lang w:val="fr-FR"/>
+        </w:rPr>
+      </w:pPr>
+      <w:r>
+        <w:rPr>
+          <w:lang w:val="fr-FR"/>
+        </w:rPr>
         <w:br w:type="page"/>
       </w:r>
     </w:p>
     <w:sdt>
       <w:sdtPr>
         <w:rPr>
+          <w:rFonts w:ascii="Calibri" w:eastAsia="Calibri" w:hAnsi="Calibri" w:cstheme="minorBidi"/>
+          <w:b w:val="0"/>
+          <w:bCs w:val="0"/>
+          <w:color w:val="auto"/>
+          <w:sz w:val="21"/>
+          <w:szCs w:val="22"/>
           <w:lang w:val="fr-FR"/>
         </w:rPr>
         <w:id w:val="-1646430735"/>
@@ -84,10 +328,6 @@
       </w:sdtPr>
       <w:sdtEndPr>
         <w:rPr>
-          <w:rFonts w:ascii="Calibri" w:eastAsia="Calibri" w:hAnsi="Calibri" w:cstheme="minorBidi"/>
-          <w:color w:val="auto"/>
-          <w:sz w:val="21"/>
-          <w:szCs w:val="22"/>
           <w:lang w:val="en-US"/>
         </w:rPr>
       </w:sdtEndPr>
@@ -4319,14 +4559,7 @@
                 <w:color w:val="000000"/>
                 <w:sz w:val="18"/>
               </w:rPr>
-              <w:t>Part</w:t>
-            </w:r>
-            <w:r>
-              <w:rPr>
-                <w:color w:val="000000"/>
-                <w:sz w:val="18"/>
-              </w:rPr>
-              <w:t xml:space="preserve"> 1</w:t>
+              <w:t>Part 1</w:t>
             </w:r>
           </w:p>
         </w:tc>
@@ -4373,14 +4606,7 @@
                 <w:color w:val="000000"/>
                 <w:sz w:val="18"/>
               </w:rPr>
-              <w:t>Part</w:t>
-            </w:r>
-            <w:r>
-              <w:rPr>
-                <w:color w:val="000000"/>
-                <w:sz w:val="18"/>
-              </w:rPr>
-              <w:t xml:space="preserve"> 2</w:t>
+              <w:t>Part 2</w:t>
             </w:r>
           </w:p>
         </w:tc>
@@ -6727,15 +6953,7 @@
       </w:r>
       <w:r>
         <w:br/>
-        <w:t>|-- README_APP.md</w:t>
-      </w:r>
-      <w:r>
-        <w:br/>
         <w:t>|-- requirements.txt</w:t>
-      </w:r>
-      <w:r>
-        <w:br/>
-        <w:t>|-- requirements-app.txt</w:t>
       </w:r>
       <w:r>
         <w:br/>
@@ -6843,9 +7061,6 @@
       </w:r>
       <w:r>
         <w:br/>
-      </w:r>
-      <w:r>
-        <w:lastRenderedPageBreak/>
         <w:t>|       |-- errors.py</w:t>
       </w:r>
       <w:r>
@@ -6854,6 +7069,9 @@
       </w:r>
       <w:r>
         <w:br/>
+      </w:r>
+      <w:r>
+        <w:lastRenderedPageBreak/>
         <w:t>|-- scripts/</w:t>
       </w:r>
       <w:r>
@@ -19453,6 +19671,19 @@
       <w:u w:val="single"/>
     </w:rPr>
   </w:style>
+  <w:style w:type="paragraph" w:styleId="NormalWeb">
+    <w:name w:val="Normal (Web)"/>
+    <w:basedOn w:val="Normal"/>
+    <w:uiPriority w:val="99"/>
+    <w:semiHidden/>
+    <w:unhideWhenUsed/>
+    <w:rsid w:val="0098247E"/>
+    <w:rPr>
+      <w:rFonts w:ascii="Times New Roman" w:hAnsi="Times New Roman" w:cs="Times New Roman"/>
+      <w:sz w:val="24"/>
+      <w:szCs w:val="24"/>
+    </w:rPr>
+  </w:style>
 </w:styles>
 </file>
 

</xml_diff>